<commit_message>
docs: make TrendWatch report more natural
</commit_message>
<xml_diff>
--- a/docs/Documento_proyecto_TrendWatch.docx
+++ b/docs/Documento_proyecto_TrendWatch.docx
@@ -193,7 +193,7 @@
         <w:spacing w:after="120" w:line="276"/>
       </w:pPr>
       <w:r>
-        <w:t xml:space="preserve">En el comercio electrónico, anticiparse a la demanda antes de que un producto se vuelva viral marca la diferencia entre aprovechar la oportunidad o llegar tarde. Un vendedor pequeño no tiene herramientas para vigilar cientos de productos y nichos, y las herramientas comerciales de análisis de mercado son de pago.</w:t>
+        <w:t>En una tienda online, detectar una tendencia a tiempo puede ayudar a aprovechar una oportunidad antes de que pase. El problema es que un vendedor pequeño no puede estar pendiente de cientos de productos y nichos a la vez, y muchas herramientas de análisis de mercado son de pago.</w:t>
       </w:r>
     </w:p>
     <w:p>
@@ -205,31 +205,23 @@
           <w:b/>
           <w:bCs/>
         </w:rPr>
-        <w:t xml:space="preserve">TrendWatch</w:t>
-      </w:r>
-      <w:r>
-        <w:t xml:space="preserve"> es un servicio con API REST que vigila una lista de productos y nichos (la </w:t>
-      </w:r>
+        <w:t>TrendWatch es una API REST que permite seguir una lista de productos o nichos. Cada día recoge datos de interés en Internet desde una fuente externa y detecta cuando alguno sube mucho más de lo habitual respecto a su media reciente.</w:t>
+      </w:r>
+      <w:r/>
       <w:r>
         <w:rPr>
           <w:i/>
           <w:iCs/>
         </w:rPr>
-        <w:t xml:space="preserve">watchlist</w:t>
-      </w:r>
-      <w:r>
-        <w:t xml:space="preserve">), obtiene cada día su interés en Internet desde una API externa, y avisa cuando el interés de uno se </w:t>
-      </w:r>
+      </w:r>
+      <w:r/>
       <w:r>
         <w:rPr>
           <w:b/>
           <w:bCs/>
         </w:rPr>
-        <w:t xml:space="preserve">dispara de forma anormal</w:t>
-      </w:r>
-      <w:r>
-        <w:t xml:space="preserve"> respecto a su media reciente.</w:t>
-      </w:r>
+      </w:r>
+      <w:r/>
     </w:p>
     <w:p>
       <w:pPr>
@@ -240,21 +232,16 @@
           <w:b/>
           <w:bCs/>
         </w:rPr>
-        <w:t xml:space="preserve">Qué es y qué no es.</w:t>
-      </w:r>
-      <w:r>
-        <w:t xml:space="preserve"> Mide </w:t>
-      </w:r>
+        <w:t>Es importante aclarar qué hace y qué no hace el proyecto: mide la atención que recibe un tema, por ejemplo mediante visitas o interés relativo, pero no mide ventas ni el número exacto de búsquedas. Sirve para detectar una subida, no para adivinar qué se hará viral. Con las fuentes gratuitas que usamos, no sería realista prometer más.</w:t>
+      </w:r>
+      <w:r/>
       <w:r>
         <w:rPr>
           <w:i/>
           <w:iCs/>
         </w:rPr>
-        <w:t xml:space="preserve">atención</w:t>
-      </w:r>
-      <w:r>
-        <w:t xml:space="preserve"> (visitas, interés relativo), no ventas ni número exacto de búsquedas. Detecta que algo está subiendo; no predice qué subirá. Lo dejamos claro desde el principio porque una promesa más grande no se podría cumplir con fuentes gratuitas.</w:t>
-      </w:r>
+      </w:r>
+      <w:r/>
     </w:p>
     <w:p>
       <w:pPr>
@@ -735,18 +722,15 @@
         <w:spacing w:after="120" w:line="276"/>
       </w:pPr>
       <w:r>
-        <w:t xml:space="preserve">Devuelve las </w:t>
+        <w:t>Esta API permite consultar las visitas diarias de artículos de Wikipedia. Es pública, oficial y gratuita, no necesita una clave y ofrece datos históricos.</w:t>
       </w:r>
       <w:r>
         <w:rPr>
           <w:b/>
           <w:bCs/>
         </w:rPr>
-        <w:t xml:space="preserve">visitas diarias a cualquier artículo de Wikipedia</w:t>
-      </w:r>
-      <w:r>
-        <w:t xml:space="preserve">. Es una API pública, oficial, gratuita y sin clave, con datos históricos.</w:t>
-      </w:r>
+      </w:r>
+      <w:r/>
     </w:p>
     <w:p>
       <w:pPr>
@@ -757,11 +741,9 @@
           <w:b/>
           <w:bCs/>
         </w:rPr>
-        <w:t xml:space="preserve">Por qué la elegimos:</w:t>
-      </w:r>
-      <w:r>
-        <w:t xml:space="preserve"> (1) es estable y está documentada, a diferencia de las vías no oficiales; (2) son recuentos reales, no un índice relativo; (3) permite una ingesta reproducible y verificable. La primera versión de nuestra idea se apoyaba solo en Google Trends y descubrimos que no era viable como única base (ver apartado 12).</w:t>
-      </w:r>
+        <w:t>La elegimos porque está documentada y es más estable que las opciones no oficiales. Además, devuelve recuentos de visitas reales en lugar de un índice relativo, así que podemos repetir y comprobar las ingestas. Al principio pensábamos usar solo Google Trends, pero vimos que dependía demasiado de una herramienta no oficial; lo explicamos en el apartado 12.</w:t>
+      </w:r>
+      <w:r/>
     </w:p>
     <w:p>
       <w:pPr>
@@ -785,21 +767,16 @@
           <w:b/>
           <w:bCs/>
         </w:rPr>
-        <w:t xml:space="preserve">Google Trends</w:t>
-      </w:r>
-      <w:r>
-        <w:t xml:space="preserve"> (mediante PyTrends): funciona con cualquier término, pero devuelve un </w:t>
-      </w:r>
+        <w:t>Google Trends, al que accedemos mediante PyTrends, permite consultar muchos términos, pero muestra un índice relativo de 0 a 100 y no el número real de búsquedas. Como PyTrends no es oficial, está archivado y a veces Google bloquea las peticiones, lo dejamos como complemento para la búsqueda libre. El sistema principal no depende de él.</w:t>
+      </w:r>
+      <w:r/>
       <w:r>
         <w:rPr>
           <w:b/>
           <w:bCs/>
         </w:rPr>
-        <w:t xml:space="preserve">índice relativo de 0 a 100</w:t>
-      </w:r>
-      <w:r>
-        <w:t xml:space="preserve">, no el número de búsquedas. PyTrends no es oficial, está archivado y Google lo bloquea a veces. Se usa solo en la búsqueda libre y nunca es imprescindible.</w:t>
-      </w:r>
+      </w:r>
+      <w:r/>
     </w:p>
     <w:p>
       <w:pPr>
@@ -815,11 +792,9 @@
           <w:b/>
           <w:bCs/>
         </w:rPr>
-        <w:t xml:space="preserve">API simulada</w:t>
-      </w:r>
-      <w:r>
-        <w:t xml:space="preserve">: reproduce el formato exacto de Wikimedia con datos deterministas. Permite ejecutar y evaluar todo el proceso de ingesta sin Internet.</w:t>
-      </w:r>
+        <w:t>La API simulada devuelve datos de prueba con el mismo formato que Wikimedia. Así podemos ejecutar y probar todo el proceso de ingesta sin necesitar conexión a Internet.</w:t>
+      </w:r>
+      <w:r/>
     </w:p>
     <w:p>
       <w:pPr>
@@ -839,27 +814,21 @@
         <w:spacing w:after="60"/>
       </w:pPr>
       <w:r>
-        <w:t xml:space="preserve">Wikimedia pide que las peticiones lleven un </w:t>
+        <w:t>Wikimedia pide que identifiquemos las peticiones con un User-Agent y un contacto, y que no abusemos del servicio. Por eso, para usar la fuente real hay que configurar WIKI_USER_AGENT y esperar un tiempo mínimo entre ingestas del mismo producto.</w:t>
       </w:r>
       <w:r>
         <w:rPr>
           <w:b/>
           <w:bCs/>
         </w:rPr>
-        <w:t xml:space="preserve">User-Agent identificable con un contacto</w:t>
-      </w:r>
-      <w:r>
-        <w:t xml:space="preserve"> y que el uso sea razonable. Por eso la ingesta real exige configurar </w:t>
-      </w:r>
+      </w:r>
+      <w:r/>
       <w:r>
         <w:rPr>
           <w:rFonts w:ascii="Consolas" w:cs="Consolas" w:eastAsia="Consolas" w:hAnsi="Consolas"/>
         </w:rPr>
-        <w:t xml:space="preserve">WIKI_USER_AGENT</w:t>
-      </w:r>
-      <w:r>
-        <w:t xml:space="preserve"> y existe una espera mínima entre ingestas del mismo producto.</w:t>
-      </w:r>
+      </w:r>
+      <w:r/>
     </w:p>
     <w:p>
       <w:pPr>
@@ -871,18 +840,15 @@
         <w:spacing w:after="60"/>
       </w:pPr>
       <w:r>
-        <w:t xml:space="preserve">Solo se guardan visitas agregadas por artículo y día: </w:t>
+        <w:t>Guardamos únicamente el total de visitas por artículo y día, sin datos personales.</w:t>
       </w:r>
       <w:r>
         <w:rPr>
           <w:b/>
           <w:bCs/>
         </w:rPr>
-        <w:t xml:space="preserve">no hay datos personales</w:t>
-      </w:r>
-      <w:r>
-        <w:t xml:space="preserve">.</w:t>
-      </w:r>
+      </w:r>
+      <w:r/>
     </w:p>
     <w:p>
       <w:pPr>
@@ -894,7 +860,7 @@
         <w:spacing w:after="60"/>
       </w:pPr>
       <w:r>
-        <w:t xml:space="preserve">Limitación: solo hay datos de productos o temas que tengan artículo en Wikipedia.</w:t>
+        <w:t>La principal limitación es que solo podemos consultar productos o temas que tengan un artículo en Wikipedia.</w:t>
       </w:r>
     </w:p>
     <w:p>
@@ -2216,7 +2182,7 @@
         <w:spacing w:after="120" w:line="276"/>
       </w:pPr>
       <w:r>
-        <w:t xml:space="preserve">La aplicación es una API FastAPI con un módulo de ingesta que consulta una fuente externa, un detector de picos y un almacén de datos en un archivo JSON con guardado atómico.</w:t>
+        <w:t>La aplicación está hecha con FastAPI. Tiene un módulo que recoge datos de una fuente externa, otro que detecta picos de interés y un archivo JSON para guardar los datos de forma segura.</w:t>
       </w:r>
     </w:p>
     <w:p>
@@ -2421,7 +2387,7 @@
         <w:spacing w:after="120" w:line="276"/>
       </w:pPr>
       <w:r>
-        <w:t xml:space="preserve">La ingesta es el proceso que trae datos de la API externa y los incorpora al servicio. Sigue cuatro etapas y está documentado paso a paso en el README para que cualquier persona pueda reproducirlo.</w:t>
+        <w:t>La ingesta consiste en traer datos de la API externa y guardarlos en nuestro servicio. El proceso tiene cuatro etapas y está explicado en el README para que se pueda repetir sin tener que adivinar los pasos.</w:t>
       </w:r>
     </w:p>
     <w:tbl>
@@ -2879,18 +2845,15 @@
         <w:spacing w:after="120" w:line="276"/>
       </w:pPr>
       <w:r>
-        <w:t xml:space="preserve">Cada ingesta devuelve un </w:t>
+        <w:t>Al terminar, cada ingesta muestra un resumen con los registros recibidos, aceptados, rechazados, insertados o actualizados, además de los motivos de rechazo. También queda guardada en un historial que puede consultar el administrador.</w:t>
       </w:r>
       <w:r>
         <w:rPr>
           <w:b/>
           <w:bCs/>
         </w:rPr>
-        <w:t xml:space="preserve">informe</w:t>
-      </w:r>
-      <w:r>
-        <w:t xml:space="preserve"> (recibidos, aceptados, rechazados, insertados, actualizados y motivos de rechazo) y queda anotada en un registro consultable por el administrador.</w:t>
-      </w:r>
+      </w:r>
+      <w:r/>
     </w:p>
     <w:p>
       <w:pPr>
@@ -3408,20 +3371,15 @@
           <w:b/>
           <w:bCs/>
         </w:rPr>
-        <w:t xml:space="preserve">Autenticación:</w:t>
-      </w:r>
-      <w:r>
-        <w:t xml:space="preserve"> clave en la cabecera </w:t>
-      </w:r>
+        <w:t>Para autenticarse, el cliente envía una clave en la cabecera X-API-Key. Si falta o no es válida, la API responde con un error 401. La comparación de claves se hace en tiempo constante.</w:t>
+      </w:r>
+      <w:r/>
       <w:r>
         <w:rPr>
           <w:rFonts w:ascii="Consolas" w:cs="Consolas" w:eastAsia="Consolas" w:hAnsi="Consolas"/>
         </w:rPr>
-        <w:t xml:space="preserve">X-API-Key</w:t>
-      </w:r>
-      <w:r>
-        <w:t xml:space="preserve">; sin clave o con clave inválida, 401. La comparación es en tiempo constante.</w:t>
-      </w:r>
+      </w:r>
+      <w:r/>
     </w:p>
     <w:p>
       <w:pPr>
@@ -3437,29 +3395,21 @@
           <w:b/>
           <w:bCs/>
         </w:rPr>
-        <w:t xml:space="preserve">Autorización por roles:</w:t>
-      </w:r>
-      <w:r>
-        <w:t xml:space="preserve"> </w:t>
-      </w:r>
+        <w:t>Hay dos roles: admin, que puede hacer todas las operaciones, e ingest, que solo puede lanzar ingestas. Si la clave es válida pero el rol no permite esa acción, se devuelve un 403. Así separamos la autenticación de los permisos.</w:t>
+      </w:r>
+      <w:r/>
       <w:r>
         <w:rPr>
           <w:rFonts w:ascii="Consolas" w:cs="Consolas" w:eastAsia="Consolas" w:hAnsi="Consolas"/>
         </w:rPr>
-        <w:t xml:space="preserve">admin</w:t>
-      </w:r>
-      <w:r>
-        <w:t xml:space="preserve"> (todo) e </w:t>
-      </w:r>
+      </w:r>
+      <w:r/>
       <w:r>
         <w:rPr>
           <w:rFonts w:ascii="Consolas" w:cs="Consolas" w:eastAsia="Consolas" w:hAnsi="Consolas"/>
         </w:rPr>
-        <w:t xml:space="preserve">ingest</w:t>
-      </w:r>
-      <w:r>
-        <w:t xml:space="preserve"> (solo ingesta, mínimo privilegio). Una clave válida sin permiso recibe 403, que distingue "quién eres" de "qué puedes hacer".</w:t>
-      </w:r>
+      </w:r>
+      <w:r/>
     </w:p>
     <w:p>
       <w:pPr>
@@ -3475,48 +3425,34 @@
           <w:b/>
           <w:bCs/>
         </w:rPr>
-        <w:t xml:space="preserve">Secretos fuera del código:</w:t>
-      </w:r>
-      <w:r>
-        <w:t xml:space="preserve"> las claves se leen de variables de entorno o de un </w:t>
-      </w:r>
+        <w:t>Las claves no se guardan en el código. Se configuran mediante variables de entorno o en un archivo .env que Git ignora. El repositorio incluye un .env.example con valores de ejemplo, y la API no arranca si falta ADMIN_API_KEY.</w:t>
+      </w:r>
+      <w:r/>
       <w:r>
         <w:rPr>
           <w:rFonts w:ascii="Consolas" w:cs="Consolas" w:eastAsia="Consolas" w:hAnsi="Consolas"/>
         </w:rPr>
-        <w:t xml:space="preserve">.env</w:t>
-      </w:r>
-      <w:r>
-        <w:t xml:space="preserve"> ignorado por Git; se incluye </w:t>
-      </w:r>
+      </w:r>
+      <w:r/>
       <w:r>
         <w:rPr>
           <w:rFonts w:ascii="Consolas" w:cs="Consolas" w:eastAsia="Consolas" w:hAnsi="Consolas"/>
         </w:rPr>
-        <w:t xml:space="preserve">.env.example</w:t>
-      </w:r>
-      <w:r>
-        <w:t xml:space="preserve"> solo con valores de ejemplo. La API </w:t>
-      </w:r>
+      </w:r>
+      <w:r/>
       <w:r>
         <w:rPr>
           <w:b/>
           <w:bCs/>
         </w:rPr>
-        <w:t xml:space="preserve">no arranca</w:t>
-      </w:r>
-      <w:r>
-        <w:t xml:space="preserve"> sin </w:t>
-      </w:r>
+      </w:r>
+      <w:r/>
       <w:r>
         <w:rPr>
           <w:rFonts w:ascii="Consolas" w:cs="Consolas" w:eastAsia="Consolas" w:hAnsi="Consolas"/>
         </w:rPr>
-        <w:t xml:space="preserve">ADMIN_API_KEY</w:t>
-      </w:r>
-      <w:r>
-        <w:t xml:space="preserve">.</w:t>
-      </w:r>
+      </w:r>
+      <w:r/>
     </w:p>
     <w:p>
       <w:pPr>
@@ -3532,11 +3468,9 @@
           <w:b/>
           <w:bCs/>
         </w:rPr>
-        <w:t xml:space="preserve">Protección de servicios externos:</w:t>
-      </w:r>
-      <w:r>
-        <w:t xml:space="preserve"> límite de peticiones por IP en la búsqueda, caché de una hora y espera mínima entre ingestas del mismo producto.</w:t>
-      </w:r>
+        <w:t>Para no sobrecargar los servicios externos, limitamos las búsquedas por IP, guardamos sus resultados en caché durante una hora y dejamos una espera mínima entre ingestas del mismo producto.</w:t>
+      </w:r>
+      <w:r/>
     </w:p>
     <w:p>
       <w:pPr>
@@ -3552,20 +3486,15 @@
           <w:b/>
           <w:bCs/>
         </w:rPr>
-        <w:t xml:space="preserve">Errores controlados:</w:t>
-      </w:r>
-      <w:r>
-        <w:t xml:space="preserve"> formato único </w:t>
-      </w:r>
+        <w:t>Los errores siguen un formato común ("detail") y, si ocurre un fallo inesperado, no mostramos los detalles internos del programa al usuario.</w:t>
+      </w:r>
+      <w:r/>
       <w:r>
         <w:rPr>
           <w:rFonts w:ascii="Consolas" w:cs="Consolas" w:eastAsia="Consolas" w:hAnsi="Consolas"/>
         </w:rPr>
-        <w:t xml:space="preserve">{"detail": ...}</w:t>
-      </w:r>
-      <w:r>
-        <w:t xml:space="preserve">; los errores inesperados no devuelven la traza al cliente.</w:t>
-      </w:r>
+      </w:r>
+      <w:r/>
     </w:p>
     <w:p>
       <w:pPr>
@@ -4847,11 +4776,9 @@
           <w:b/>
           <w:bCs/>
         </w:rPr>
-        <w:t xml:space="preserve">Reparto propuesto por áreas:</w:t>
-      </w:r>
-      <w:r>
-        <w:t xml:space="preserve"> Alessandro, conectores y datos; Eduardo, detector y backtest; Jordi, API y modelos; Pablo, infraestructura, contenedores y despliegue. Las áreas se pueden intercambiar.</w:t>
-      </w:r>
+        <w:t>Como reparto inicial, Alessandro se encarga de los conectores y los datos; Eduardo, del detector y el backtest; Jordi, de la API y los modelos; y Pablo, de la infraestructura, los contenedores y el despliegue. Podemos cambiar las tareas si hace falta.</w:t>
+      </w:r>
+      <w:r/>
     </w:p>
     <w:p>
       <w:pPr>
@@ -4866,7 +4793,7 @@
         <w:spacing w:after="120" w:line="276"/>
       </w:pPr>
       <w:r>
-        <w:t xml:space="preserve">La primera entrega fue insuficiente. Esto es lo que se ha corregido:</w:t>
+        <w:t>En la primera entrega faltaban varias partes importantes. En esta versión hemos añadido o corregido lo siguiente:</w:t>
       </w:r>
     </w:p>
     <w:tbl>

</xml_diff>